<commit_message>
Score Exponencial — v1.0.5 registrada: protocolo do teste aprovado; código do teste fixado para a rodada única
Co-Authored-By: Claude Opus 5.5 <noreply@anthropic.com>
Claude-Session: https://claude.ai/code/session_01HefRF4fGJRzRQKWSK6E8Hc
</commit_message>
<xml_diff>
--- a/docs/Score_Exponencial_protocolo_teste_v1.0.5.docx
+++ b/docs/Score_Exponencial_protocolo_teste_v1.0.5.docx
@@ -90,7 +90,7 @@
           <w:sz w:val="24"/>
           <w:szCs w:val="24"/>
         </w:rPr>
-        <w:t xml:space="preserve">Proposta de versão 1.0.5 — para aprovação</w:t>
+        <w:t xml:space="preserve">Versão 1.0.5 — aprovada em 22 de outubro de 2026</w:t>
       </w:r>
     </w:p>
     <w:p>
@@ -192,7 +192,7 @@
         <w:keepLines/>
       </w:pPr>
       <w:r>
-        <w:t xml:space="preserve">Decisões para aprovar</w:t>
+        <w:t xml:space="preserve">Decisões aprovadas em 22/10/2026</w:t>
       </w:r>
     </w:p>
     <w:p>
@@ -4917,7 +4917,7 @@
         <w:sz w:val="17"/>
         <w:szCs w:val="17"/>
       </w:rPr>
-      <w:t xml:space="preserve">	Protocolo do teste — proposta v1.0.5</w:t>
+      <w:t xml:space="preserve">	Protocolo do teste v1.0.5</w:t>
     </w:r>
   </w:p>
 </w:hdr>

</xml_diff>